<commit_message>
Add 10-minute presentation slides (INLANEFREIGHT_AD_Compromise_Presentation.pptx) and update report with chapter page breaks
</commit_message>
<xml_diff>
--- a/docs/INLANEFREIGHT_AD_Compromise_Report.docx
+++ b/docs/INLANEFREIGHT_AD_Compromise_Report.docx
@@ -3218,6 +3218,11 @@
       </w:r>
     </w:p>
     <w:p>
+      <w:r>
+        <w:br w:type="page"/>
+      </w:r>
+    </w:p>
+    <w:p>
       <w:pPr>
         <w:keepNext/>
         <w:spacing w:before="360" w:after="120"/>
@@ -3976,6 +3981,11 @@
       </w:r>
     </w:p>
     <w:p>
+      <w:r>
+        <w:br w:type="page"/>
+      </w:r>
+    </w:p>
+    <w:p>
       <w:pPr>
         <w:keepNext/>
         <w:spacing w:before="360" w:after="120"/>
@@ -4301,6 +4311,11 @@
           <w:sz w:val="22"/>
         </w:rPr>
         <w:t>Leveraging GenericAll permissions to add ttimmons into the Server Admins group, exploiting GetChanges/GetChangesAll replication rights to DCSync all NTLM hashes, and Pass-the-Hash authentication as Administrator.</w:t>
+      </w:r>
+    </w:p>
+    <w:p>
+      <w:r>
+        <w:br w:type="page"/>
       </w:r>
     </w:p>
     <w:p>
@@ -8375,6 +8390,11 @@
       </w:r>
     </w:p>
     <w:p>
+      <w:r>
+        <w:br w:type="page"/>
+      </w:r>
+    </w:p>
+    <w:p>
       <w:pPr>
         <w:keepNext/>
         <w:spacing w:before="360" w:after="120"/>
@@ -8550,6 +8570,11 @@
           <w:sz w:val="22"/>
         </w:rPr>
         <w:t>[8] National Institute of Standards and Technology, "NIST SP 800-115: Technical Guide to Information Security Testing and Assessment," U.S. Department of Commerce, 2020.</w:t>
+      </w:r>
+    </w:p>
+    <w:p>
+      <w:r>
+        <w:br w:type="page"/>
       </w:r>
     </w:p>
     <w:p>
@@ -9256,19 +9281,6 @@
                 <w:sz w:val="19"/>
               </w:rPr>
               <w:t xml:space="preserve">    print(f"    Executing: {cmd}")</w:t>
-            </w:r>
-          </w:p>
-          <w:p>
-            <w:pPr>
-              <w:spacing w:before="0" w:after="40" w:line="240" w:lineRule="auto"/>
-            </w:pPr>
-            <w:r>
-              <w:rPr>
-                <w:rFonts w:ascii="Consolas" w:hAnsi="Consolas"/>
-                <w:color w:val="24292E"/>
-                <w:sz w:val="19"/>
-              </w:rPr>
-              <w:t xml:space="preserve">    # Subprocess execution wrapper for lab testing</w:t>
             </w:r>
           </w:p>
           <w:p>

</xml_diff>

<commit_message>
Add Table of Figures and Tables to report, replace em-dashes, and polish executive presentation slides
</commit_message>
<xml_diff>
--- a/docs/INLANEFREIGHT_AD_Compromise_Report.docx
+++ b/docs/INLANEFREIGHT_AD_Compromise_Report.docx
@@ -425,7 +425,7 @@
           <w:color w:val="333333"/>
           <w:sz w:val="22"/>
         </w:rPr>
-        <w:t>This report presents the findings, methodology, technical execution, and strategic recommendations resulting from a simulated internal penetration test conducted against the Active Directory domain INLANEFREIGHT.LOCAL. Operating under an assumed-breach threat model, the Red Team assessment initiated with a single low-privileged domain credential (hporter) and systematically identified, enumerated, and chained multiple security misconfigurations across the Active Directory environment. The assessment demonstrated how seemingly minor, decoupled configuration oversights—such as excessive Access Control List (ACL) delegations, cleartext credential storage on accessible network file shares, uncleaned deployment answer files, vulnerable third-party local services, cleartext LSA autologon registry secrets, targeted Kerberoasting via GenericWrite permissions, and unmonitored directory replication rights—can be combined by a motivated adversary to achieve complete, unrestricted domain compromise (DCSync) without triggering traditional anti-virus or perimeter defenses.</w:t>
+        <w:t>This report presents the findings, methodology, technical execution, and strategic recommendations resulting from a simulated internal penetration test conducted against the Active Directory domain INLANEFREIGHT.LOCAL. Operating under an assumed-breach threat model, the Red Team assessment initiated with a single low-privileged domain credential (hporter) and systematically identified, enumerated, and chained multiple security misconfigurations across the Active Directory environment. The assessment demonstrated how seemingly minor, decoupled configuration oversights - such as excessive Access Control List (ACL) delegations, cleartext credential storage on accessible network file shares, uncleaned deployment answer files, vulnerable third-party local services, cleartext LSA autologon registry secrets, targeted Kerberoasting via GenericWrite permissions, and unmonitored directory replication rights - can be combined by a motivated adversary to achieve complete, unrestricted domain compromise (DCSync) without triggering traditional anti-virus or perimeter defenses.</w:t>
       </w:r>
     </w:p>
     <w:p>
@@ -438,7 +438,7 @@
           <w:color w:val="333333"/>
           <w:sz w:val="22"/>
         </w:rPr>
-        <w:t>Throughout the 12-stage attack chain narrative, empirical evidence—including full command execution syntax, network captures, and annotated screenshots—is provided to substantiate each privilege escalation step. The evaluation highlights that zero-day vulnerabilities were unnecessary for total domain compromise; rather, native Windows functionality, misconfigured delegations, and credential hygiene failures were fully leveraged. Finally, this document outlines a prioritized remediation roadmap aligned with the CIS Controls for Active Directory Security and MITRE ATT&amp;CK mitigation strategies, emphasizing Tiered Administration, Privileged Access Management (PAM), Group Managed Service Accounts (gMSAs), LSA Protection (RunAsPPL), and strict replication rights auditing.</w:t>
+        <w:t>Throughout the 12-stage attack chain narrative, empirical evidence - including full command execution syntax, network captures, and annotated screenshots - is provided to substantiate each privilege escalation step. The evaluation highlights that zero-day vulnerabilities were unnecessary for total domain compromise; rather, native Windows functionality, misconfigured delegations, and credential hygiene failures were fully leveraged. Finally, this document outlines a prioritized remediation roadmap aligned with the CIS Controls for Active Directory Security and MITRE ATT&amp;CK mitigation strategies, emphasizing Tiered Administration, Privileged Access Management (PAM), Group Managed Service Accounts (gMSAs), LSA Protection (RunAsPPL), and strict replication rights auditing.</w:t>
       </w:r>
     </w:p>
     <w:p>
@@ -607,6 +607,58 @@
                 <w:b/>
                 <w:sz w:val="20"/>
               </w:rPr>
+              <w:t>Table of Contents &amp; List of Figures</w:t>
+            </w:r>
+          </w:p>
+        </w:tc>
+        <w:tc>
+          <w:tcPr>
+            <w:tcW w:type="dxa" w:w="1440"/>
+            <w:tcMar>
+              <w:top w:w="40" w:type="dxa"/>
+              <w:bottom w:w="40" w:type="dxa"/>
+              <w:left w:w="100" w:type="dxa"/>
+              <w:right w:w="100" w:type="dxa"/>
+            </w:tcMar>
+            <w:shd w:fill="F2F4F7"/>
+          </w:tcPr>
+          <w:p>
+            <w:pPr>
+              <w:spacing w:after="0"/>
+              <w:jc w:val="right"/>
+            </w:pPr>
+            <w:r>
+              <w:rPr>
+                <w:rFonts w:ascii="Calibri" w:hAnsi="Calibri"/>
+                <w:sz w:val="20"/>
+              </w:rPr>
+              <w:t>3</w:t>
+            </w:r>
+          </w:p>
+        </w:tc>
+      </w:tr>
+      <w:tr>
+        <w:tc>
+          <w:tcPr>
+            <w:tcW w:type="dxa" w:w="7920"/>
+            <w:tcMar>
+              <w:top w:w="40" w:type="dxa"/>
+              <w:bottom w:w="40" w:type="dxa"/>
+              <w:left w:w="100" w:type="dxa"/>
+              <w:right w:w="100" w:type="dxa"/>
+            </w:tcMar>
+            <w:shd w:fill="F2F4F7"/>
+          </w:tcPr>
+          <w:p>
+            <w:pPr>
+              <w:spacing w:after="0"/>
+            </w:pPr>
+            <w:r>
+              <w:rPr>
+                <w:rFonts w:ascii="Calibri" w:hAnsi="Calibri"/>
+                <w:b/>
+                <w:sz w:val="20"/>
+              </w:rPr>
               <w:t>1. Introduction</w:t>
             </w:r>
           </w:p>
@@ -632,7 +684,7 @@
                 <w:rFonts w:ascii="Calibri" w:hAnsi="Calibri"/>
                 <w:sz w:val="20"/>
               </w:rPr>
-              <w:t>4</w:t>
+              <w:t>5</w:t>
             </w:r>
           </w:p>
         </w:tc>
@@ -684,7 +736,7 @@
                 <w:rFonts w:ascii="Calibri" w:hAnsi="Calibri"/>
                 <w:sz w:val="20"/>
               </w:rPr>
-              <w:t>4</w:t>
+              <w:t>5</w:t>
             </w:r>
           </w:p>
         </w:tc>
@@ -736,7 +788,7 @@
                 <w:rFonts w:ascii="Calibri" w:hAnsi="Calibri"/>
                 <w:sz w:val="20"/>
               </w:rPr>
-              <w:t>4</w:t>
+              <w:t>5</w:t>
             </w:r>
           </w:p>
         </w:tc>
@@ -788,7 +840,7 @@
                 <w:rFonts w:ascii="Calibri" w:hAnsi="Calibri"/>
                 <w:sz w:val="20"/>
               </w:rPr>
-              <w:t>5</w:t>
+              <w:t>6</w:t>
             </w:r>
           </w:p>
         </w:tc>
@@ -840,7 +892,7 @@
                 <w:rFonts w:ascii="Calibri" w:hAnsi="Calibri"/>
                 <w:sz w:val="20"/>
               </w:rPr>
-              <w:t>6</w:t>
+              <w:t>7</w:t>
             </w:r>
           </w:p>
         </w:tc>
@@ -892,7 +944,7 @@
                 <w:rFonts w:ascii="Calibri" w:hAnsi="Calibri"/>
                 <w:sz w:val="20"/>
               </w:rPr>
-              <w:t>6</w:t>
+              <w:t>7</w:t>
             </w:r>
           </w:p>
         </w:tc>
@@ -944,7 +996,7 @@
                 <w:rFonts w:ascii="Calibri" w:hAnsi="Calibri"/>
                 <w:sz w:val="20"/>
               </w:rPr>
-              <w:t>7</w:t>
+              <w:t>8</w:t>
             </w:r>
           </w:p>
         </w:tc>
@@ -996,7 +1048,7 @@
                 <w:rFonts w:ascii="Calibri" w:hAnsi="Calibri"/>
                 <w:sz w:val="20"/>
               </w:rPr>
-              <w:t>8</w:t>
+              <w:t>9</w:t>
             </w:r>
           </w:p>
         </w:tc>
@@ -1048,7 +1100,7 @@
                 <w:rFonts w:ascii="Calibri" w:hAnsi="Calibri"/>
                 <w:sz w:val="20"/>
               </w:rPr>
-              <w:t>8</w:t>
+              <w:t>9</w:t>
             </w:r>
           </w:p>
         </w:tc>
@@ -1100,7 +1152,7 @@
                 <w:rFonts w:ascii="Calibri" w:hAnsi="Calibri"/>
                 <w:sz w:val="20"/>
               </w:rPr>
-              <w:t>9</w:t>
+              <w:t>10</w:t>
             </w:r>
           </w:p>
         </w:tc>
@@ -1152,7 +1204,7 @@
                 <w:rFonts w:ascii="Calibri" w:hAnsi="Calibri"/>
                 <w:sz w:val="20"/>
               </w:rPr>
-              <w:t>10</w:t>
+              <w:t>11</w:t>
             </w:r>
           </w:p>
         </w:tc>
@@ -1204,7 +1256,7 @@
                 <w:rFonts w:ascii="Calibri" w:hAnsi="Calibri"/>
                 <w:sz w:val="20"/>
               </w:rPr>
-              <w:t>11</w:t>
+              <w:t>12</w:t>
             </w:r>
           </w:p>
         </w:tc>
@@ -1256,7 +1308,7 @@
                 <w:rFonts w:ascii="Calibri" w:hAnsi="Calibri"/>
                 <w:sz w:val="20"/>
               </w:rPr>
-              <w:t>11</w:t>
+              <w:t>12</w:t>
             </w:r>
           </w:p>
         </w:tc>
@@ -1308,7 +1360,7 @@
                 <w:rFonts w:ascii="Calibri" w:hAnsi="Calibri"/>
                 <w:sz w:val="20"/>
               </w:rPr>
-              <w:t>11</w:t>
+              <w:t>12</w:t>
             </w:r>
           </w:p>
         </w:tc>
@@ -1360,7 +1412,7 @@
                 <w:rFonts w:ascii="Calibri" w:hAnsi="Calibri"/>
                 <w:sz w:val="20"/>
               </w:rPr>
-              <w:t>12</w:t>
+              <w:t>13</w:t>
             </w:r>
           </w:p>
         </w:tc>
@@ -1412,7 +1464,7 @@
                 <w:rFonts w:ascii="Calibri" w:hAnsi="Calibri"/>
                 <w:sz w:val="20"/>
               </w:rPr>
-              <w:t>12</w:t>
+              <w:t>13</w:t>
             </w:r>
           </w:p>
         </w:tc>
@@ -1464,7 +1516,7 @@
                 <w:rFonts w:ascii="Calibri" w:hAnsi="Calibri"/>
                 <w:sz w:val="20"/>
               </w:rPr>
-              <w:t>13</w:t>
+              <w:t>14</w:t>
             </w:r>
           </w:p>
         </w:tc>
@@ -1516,7 +1568,7 @@
                 <w:rFonts w:ascii="Calibri" w:hAnsi="Calibri"/>
                 <w:sz w:val="20"/>
               </w:rPr>
-              <w:t>14</w:t>
+              <w:t>15</w:t>
             </w:r>
           </w:p>
         </w:tc>
@@ -1568,7 +1620,7 @@
                 <w:rFonts w:ascii="Calibri" w:hAnsi="Calibri"/>
                 <w:sz w:val="20"/>
               </w:rPr>
-              <w:t>15</w:t>
+              <w:t>16</w:t>
             </w:r>
           </w:p>
         </w:tc>
@@ -1620,7 +1672,7 @@
                 <w:rFonts w:ascii="Calibri" w:hAnsi="Calibri"/>
                 <w:sz w:val="20"/>
               </w:rPr>
-              <w:t>16</w:t>
+              <w:t>17</w:t>
             </w:r>
           </w:p>
         </w:tc>
@@ -1672,7 +1724,7 @@
                 <w:rFonts w:ascii="Calibri" w:hAnsi="Calibri"/>
                 <w:sz w:val="20"/>
               </w:rPr>
-              <w:t>17</w:t>
+              <w:t>18</w:t>
             </w:r>
           </w:p>
         </w:tc>
@@ -1724,7 +1776,7 @@
                 <w:rFonts w:ascii="Calibri" w:hAnsi="Calibri"/>
                 <w:sz w:val="20"/>
               </w:rPr>
-              <w:t>18</w:t>
+              <w:t>19</w:t>
             </w:r>
           </w:p>
         </w:tc>
@@ -1776,7 +1828,7 @@
                 <w:rFonts w:ascii="Calibri" w:hAnsi="Calibri"/>
                 <w:sz w:val="20"/>
               </w:rPr>
-              <w:t>19</w:t>
+              <w:t>20</w:t>
             </w:r>
           </w:p>
         </w:tc>
@@ -1828,7 +1880,7 @@
                 <w:rFonts w:ascii="Calibri" w:hAnsi="Calibri"/>
                 <w:sz w:val="20"/>
               </w:rPr>
-              <w:t>20</w:t>
+              <w:t>21</w:t>
             </w:r>
           </w:p>
         </w:tc>
@@ -1880,7 +1932,7 @@
                 <w:rFonts w:ascii="Calibri" w:hAnsi="Calibri"/>
                 <w:sz w:val="20"/>
               </w:rPr>
-              <w:t>21</w:t>
+              <w:t>22</w:t>
             </w:r>
           </w:p>
         </w:tc>
@@ -1907,7 +1959,7 @@
                 <w:b/>
                 <w:sz w:val="20"/>
               </w:rPr>
-              <w:t xml:space="preserve">   5.11 Stage 11: DCSync Attack — Full Domain Credential Extraction</w:t>
+              <w:t xml:space="preserve">   5.11 Stage 11: DCSync Attack - Full Domain Credential Extraction</w:t>
             </w:r>
           </w:p>
         </w:tc>
@@ -1932,7 +1984,7 @@
                 <w:rFonts w:ascii="Calibri" w:hAnsi="Calibri"/>
                 <w:sz w:val="20"/>
               </w:rPr>
-              <w:t>22</w:t>
+              <w:t>23</w:t>
             </w:r>
           </w:p>
         </w:tc>
@@ -1984,7 +2036,7 @@
                 <w:rFonts w:ascii="Calibri" w:hAnsi="Calibri"/>
                 <w:sz w:val="20"/>
               </w:rPr>
-              <w:t>23</w:t>
+              <w:t>24</w:t>
             </w:r>
           </w:p>
         </w:tc>
@@ -2036,7 +2088,7 @@
                 <w:rFonts w:ascii="Calibri" w:hAnsi="Calibri"/>
                 <w:sz w:val="20"/>
               </w:rPr>
-              <w:t>24</w:t>
+              <w:t>25</w:t>
             </w:r>
           </w:p>
         </w:tc>
@@ -2088,7 +2140,7 @@
                 <w:rFonts w:ascii="Calibri" w:hAnsi="Calibri"/>
                 <w:sz w:val="20"/>
               </w:rPr>
-              <w:t>24</w:t>
+              <w:t>25</w:t>
             </w:r>
           </w:p>
         </w:tc>
@@ -2140,7 +2192,7 @@
                 <w:rFonts w:ascii="Calibri" w:hAnsi="Calibri"/>
                 <w:sz w:val="20"/>
               </w:rPr>
-              <w:t>25</w:t>
+              <w:t>26</w:t>
             </w:r>
           </w:p>
         </w:tc>
@@ -2192,7 +2244,7 @@
                 <w:rFonts w:ascii="Calibri" w:hAnsi="Calibri"/>
                 <w:sz w:val="20"/>
               </w:rPr>
-              <w:t>26</w:t>
+              <w:t>27</w:t>
             </w:r>
           </w:p>
         </w:tc>
@@ -2244,7 +2296,7 @@
                 <w:rFonts w:ascii="Calibri" w:hAnsi="Calibri"/>
                 <w:sz w:val="20"/>
               </w:rPr>
-              <w:t>28</w:t>
+              <w:t>29</w:t>
             </w:r>
           </w:p>
         </w:tc>
@@ -2296,7 +2348,7 @@
                 <w:rFonts w:ascii="Calibri" w:hAnsi="Calibri"/>
                 <w:sz w:val="20"/>
               </w:rPr>
-              <w:t>29</w:t>
+              <w:t>30</w:t>
             </w:r>
           </w:p>
         </w:tc>
@@ -2348,7 +2400,7 @@
                 <w:rFonts w:ascii="Calibri" w:hAnsi="Calibri"/>
                 <w:sz w:val="20"/>
               </w:rPr>
-              <w:t>30</w:t>
+              <w:t>31</w:t>
             </w:r>
           </w:p>
         </w:tc>
@@ -2399,7 +2451,7 @@
                 <w:rFonts w:ascii="Calibri" w:hAnsi="Calibri"/>
                 <w:sz w:val="20"/>
               </w:rPr>
-              <w:t>30</w:t>
+              <w:t>31</w:t>
             </w:r>
           </w:p>
         </w:tc>
@@ -2450,7 +2502,1095 @@
                 <w:rFonts w:ascii="Calibri" w:hAnsi="Calibri"/>
                 <w:sz w:val="20"/>
               </w:rPr>
-              <w:t>31</w:t>
+              <w:t>32</w:t>
+            </w:r>
+          </w:p>
+        </w:tc>
+      </w:tr>
+    </w:tbl>
+    <w:p>
+      <w:r>
+        <w:br w:type="page"/>
+      </w:r>
+    </w:p>
+    <w:p>
+      <w:pPr>
+        <w:keepNext/>
+        <w:spacing w:before="360" w:after="120"/>
+      </w:pPr>
+      <w:r>
+        <w:rPr>
+          <w:rFonts w:ascii="Calibri" w:hAnsi="Calibri"/>
+          <w:b/>
+          <w:color w:val="1F4E79"/>
+          <w:sz w:val="36"/>
+        </w:rPr>
+        <w:t>List of Figures and Tables</w:t>
+      </w:r>
+    </w:p>
+    <w:p>
+      <w:pPr>
+        <w:keepNext/>
+        <w:spacing w:before="280" w:after="80"/>
+      </w:pPr>
+      <w:r>
+        <w:rPr>
+          <w:rFonts w:ascii="Calibri" w:hAnsi="Calibri"/>
+          <w:b/>
+          <w:color w:val="2F5597"/>
+          <w:sz w:val="28"/>
+        </w:rPr>
+        <w:t>List of Figures</w:t>
+      </w:r>
+    </w:p>
+    <w:tbl>
+      <w:tblPr>
+        <w:tblW w:type="auto" w:w="0"/>
+        <w:jc w:val="center"/>
+        <w:tblLook w:firstColumn="1" w:firstRow="1" w:lastColumn="0" w:lastRow="0" w:noHBand="0" w:noVBand="1" w:val="04A0"/>
+      </w:tblPr>
+      <w:tblGrid>
+        <w:gridCol w:w="4680"/>
+        <w:gridCol w:w="4680"/>
+      </w:tblGrid>
+      <w:tr>
+        <w:tc>
+          <w:tcPr>
+            <w:tcW w:type="dxa" w:w="7920"/>
+            <w:shd w:fill="1F4E79"/>
+            <w:tcMar>
+              <w:top w:w="80" w:type="dxa"/>
+              <w:bottom w:w="80" w:type="dxa"/>
+              <w:left w:w="100" w:type="dxa"/>
+              <w:right w:w="100" w:type="dxa"/>
+            </w:tcMar>
+          </w:tcPr>
+          <w:p>
+            <w:r>
+              <w:rPr>
+                <w:rFonts w:ascii="Calibri" w:hAnsi="Calibri"/>
+                <w:b/>
+                <w:color w:val="FFFFFF"/>
+              </w:rPr>
+              <w:t>Figure Caption &amp; Description</w:t>
+            </w:r>
+          </w:p>
+        </w:tc>
+        <w:tc>
+          <w:tcPr>
+            <w:tcW w:type="dxa" w:w="1440"/>
+            <w:shd w:fill="1F4E79"/>
+            <w:tcMar>
+              <w:top w:w="80" w:type="dxa"/>
+              <w:bottom w:w="80" w:type="dxa"/>
+              <w:left w:w="100" w:type="dxa"/>
+              <w:right w:w="100" w:type="dxa"/>
+            </w:tcMar>
+          </w:tcPr>
+          <w:p>
+            <w:pPr>
+              <w:jc w:val="right"/>
+            </w:pPr>
+            <w:r>
+              <w:rPr>
+                <w:rFonts w:ascii="Calibri" w:hAnsi="Calibri"/>
+                <w:b/>
+                <w:color w:val="FFFFFF"/>
+              </w:rPr>
+              <w:t>Page</w:t>
+            </w:r>
+          </w:p>
+        </w:tc>
+      </w:tr>
+      <w:tr>
+        <w:tc>
+          <w:tcPr>
+            <w:tcW w:type="dxa" w:w="7920"/>
+            <w:tcMar>
+              <w:top w:w="40" w:type="dxa"/>
+              <w:bottom w:w="40" w:type="dxa"/>
+              <w:left w:w="100" w:type="dxa"/>
+              <w:right w:w="100" w:type="dxa"/>
+            </w:tcMar>
+            <w:shd w:fill="FFFFFF"/>
+          </w:tcPr>
+          <w:p>
+            <w:pPr>
+              <w:spacing w:after="0"/>
+            </w:pPr>
+            <w:r>
+              <w:rPr>
+                <w:rFonts w:ascii="Calibri" w:hAnsi="Calibri"/>
+                <w:sz w:val="19"/>
+              </w:rPr>
+              <w:t>Figure 1: NetExec SMB Credential Verification for hporter against DC01</w:t>
+            </w:r>
+          </w:p>
+        </w:tc>
+        <w:tc>
+          <w:tcPr>
+            <w:tcW w:type="dxa" w:w="1440"/>
+            <w:tcMar>
+              <w:top w:w="40" w:type="dxa"/>
+              <w:bottom w:w="40" w:type="dxa"/>
+              <w:left w:w="100" w:type="dxa"/>
+              <w:right w:w="100" w:type="dxa"/>
+            </w:tcMar>
+            <w:shd w:fill="FFFFFF"/>
+          </w:tcPr>
+          <w:p>
+            <w:pPr>
+              <w:spacing w:after="0"/>
+              <w:jc w:val="right"/>
+            </w:pPr>
+            <w:r>
+              <w:rPr>
+                <w:rFonts w:ascii="Calibri" w:hAnsi="Calibri"/>
+                <w:sz w:val="19"/>
+              </w:rPr>
+              <w:t>13</w:t>
+            </w:r>
+          </w:p>
+        </w:tc>
+      </w:tr>
+      <w:tr>
+        <w:tc>
+          <w:tcPr>
+            <w:tcW w:type="dxa" w:w="7920"/>
+            <w:tcMar>
+              <w:top w:w="40" w:type="dxa"/>
+              <w:bottom w:w="40" w:type="dxa"/>
+              <w:left w:w="100" w:type="dxa"/>
+              <w:right w:w="100" w:type="dxa"/>
+            </w:tcMar>
+            <w:shd w:fill="FFFFFF"/>
+          </w:tcPr>
+          <w:p>
+            <w:pPr>
+              <w:spacing w:after="0"/>
+            </w:pPr>
+            <w:r>
+              <w:rPr>
+                <w:rFonts w:ascii="Calibri" w:hAnsi="Calibri"/>
+                <w:sz w:val="19"/>
+              </w:rPr>
+              <w:t>Figure 2: BloodHound ACL Analysis Revealing ForceChangePassword Right over ssmalls</w:t>
+            </w:r>
+          </w:p>
+        </w:tc>
+        <w:tc>
+          <w:tcPr>
+            <w:tcW w:type="dxa" w:w="1440"/>
+            <w:tcMar>
+              <w:top w:w="40" w:type="dxa"/>
+              <w:bottom w:w="40" w:type="dxa"/>
+              <w:left w:w="100" w:type="dxa"/>
+              <w:right w:w="100" w:type="dxa"/>
+            </w:tcMar>
+            <w:shd w:fill="FFFFFF"/>
+          </w:tcPr>
+          <w:p>
+            <w:pPr>
+              <w:spacing w:after="0"/>
+              <w:jc w:val="right"/>
+            </w:pPr>
+            <w:r>
+              <w:rPr>
+                <w:rFonts w:ascii="Calibri" w:hAnsi="Calibri"/>
+                <w:sz w:val="19"/>
+              </w:rPr>
+              <w:t>14</w:t>
+            </w:r>
+          </w:p>
+        </w:tc>
+      </w:tr>
+      <w:tr>
+        <w:tc>
+          <w:tcPr>
+            <w:tcW w:type="dxa" w:w="7920"/>
+            <w:tcMar>
+              <w:top w:w="40" w:type="dxa"/>
+              <w:bottom w:w="40" w:type="dxa"/>
+              <w:left w:w="100" w:type="dxa"/>
+              <w:right w:w="100" w:type="dxa"/>
+            </w:tcMar>
+            <w:shd w:fill="FFFFFF"/>
+          </w:tcPr>
+          <w:p>
+            <w:pPr>
+              <w:spacing w:after="0"/>
+            </w:pPr>
+            <w:r>
+              <w:rPr>
+                <w:rFonts w:ascii="Calibri" w:hAnsi="Calibri"/>
+                <w:sz w:val="19"/>
+              </w:rPr>
+              <w:t>Figure 3: Password Reset Execution over ssmalls via bloodyAD and NetExec SMB Verification</w:t>
+            </w:r>
+          </w:p>
+        </w:tc>
+        <w:tc>
+          <w:tcPr>
+            <w:tcW w:type="dxa" w:w="1440"/>
+            <w:tcMar>
+              <w:top w:w="40" w:type="dxa"/>
+              <w:bottom w:w="40" w:type="dxa"/>
+              <w:left w:w="100" w:type="dxa"/>
+              <w:right w:w="100" w:type="dxa"/>
+            </w:tcMar>
+            <w:shd w:fill="FFFFFF"/>
+          </w:tcPr>
+          <w:p>
+            <w:pPr>
+              <w:spacing w:after="0"/>
+              <w:jc w:val="right"/>
+            </w:pPr>
+            <w:r>
+              <w:rPr>
+                <w:rFonts w:ascii="Calibri" w:hAnsi="Calibri"/>
+                <w:sz w:val="19"/>
+              </w:rPr>
+              <w:t>15</w:t>
+            </w:r>
+          </w:p>
+        </w:tc>
+      </w:tr>
+      <w:tr>
+        <w:tc>
+          <w:tcPr>
+            <w:tcW w:type="dxa" w:w="7920"/>
+            <w:tcMar>
+              <w:top w:w="40" w:type="dxa"/>
+              <w:bottom w:w="40" w:type="dxa"/>
+              <w:left w:w="100" w:type="dxa"/>
+              <w:right w:w="100" w:type="dxa"/>
+            </w:tcMar>
+            <w:shd w:fill="FFFFFF"/>
+          </w:tcPr>
+          <w:p>
+            <w:pPr>
+              <w:spacing w:after="0"/>
+            </w:pPr>
+            <w:r>
+              <w:rPr>
+                <w:rFonts w:ascii="Calibri" w:hAnsi="Calibri"/>
+                <w:sz w:val="19"/>
+              </w:rPr>
+              <w:t>Figure 4: SMB Share Spidering and Extraction of Cleartext Credentials from Backup Script</w:t>
+            </w:r>
+          </w:p>
+        </w:tc>
+        <w:tc>
+          <w:tcPr>
+            <w:tcW w:type="dxa" w:w="1440"/>
+            <w:tcMar>
+              <w:top w:w="40" w:type="dxa"/>
+              <w:bottom w:w="40" w:type="dxa"/>
+              <w:left w:w="100" w:type="dxa"/>
+              <w:right w:w="100" w:type="dxa"/>
+            </w:tcMar>
+            <w:shd w:fill="FFFFFF"/>
+          </w:tcPr>
+          <w:p>
+            <w:pPr>
+              <w:spacing w:after="0"/>
+              <w:jc w:val="right"/>
+            </w:pPr>
+            <w:r>
+              <w:rPr>
+                <w:rFonts w:ascii="Calibri" w:hAnsi="Calibri"/>
+                <w:sz w:val="19"/>
+              </w:rPr>
+              <w:t>16</w:t>
+            </w:r>
+          </w:p>
+        </w:tc>
+      </w:tr>
+      <w:tr>
+        <w:tc>
+          <w:tcPr>
+            <w:tcW w:type="dxa" w:w="7920"/>
+            <w:tcMar>
+              <w:top w:w="40" w:type="dxa"/>
+              <w:bottom w:w="40" w:type="dxa"/>
+              <w:left w:w="100" w:type="dxa"/>
+              <w:right w:w="100" w:type="dxa"/>
+            </w:tcMar>
+            <w:shd w:fill="FFFFFF"/>
+          </w:tcPr>
+          <w:p>
+            <w:pPr>
+              <w:spacing w:after="0"/>
+            </w:pPr>
+            <w:r>
+              <w:rPr>
+                <w:rFonts w:ascii="Calibri" w:hAnsi="Calibri"/>
+                <w:sz w:val="19"/>
+              </w:rPr>
+              <w:t>Figure 5: Evil-WinRM Remote Interactive Shell Established on MS01 as backupadm</w:t>
+            </w:r>
+          </w:p>
+        </w:tc>
+        <w:tc>
+          <w:tcPr>
+            <w:tcW w:type="dxa" w:w="1440"/>
+            <w:tcMar>
+              <w:top w:w="40" w:type="dxa"/>
+              <w:bottom w:w="40" w:type="dxa"/>
+              <w:left w:w="100" w:type="dxa"/>
+              <w:right w:w="100" w:type="dxa"/>
+            </w:tcMar>
+            <w:shd w:fill="FFFFFF"/>
+          </w:tcPr>
+          <w:p>
+            <w:pPr>
+              <w:spacing w:after="0"/>
+              <w:jc w:val="right"/>
+            </w:pPr>
+            <w:r>
+              <w:rPr>
+                <w:rFonts w:ascii="Calibri" w:hAnsi="Calibri"/>
+                <w:sz w:val="19"/>
+              </w:rPr>
+              <w:t>17</w:t>
+            </w:r>
+          </w:p>
+        </w:tc>
+      </w:tr>
+      <w:tr>
+        <w:tc>
+          <w:tcPr>
+            <w:tcW w:type="dxa" w:w="7920"/>
+            <w:tcMar>
+              <w:top w:w="40" w:type="dxa"/>
+              <w:bottom w:w="40" w:type="dxa"/>
+              <w:left w:w="100" w:type="dxa"/>
+              <w:right w:w="100" w:type="dxa"/>
+            </w:tcMar>
+            <w:shd w:fill="FFFFFF"/>
+          </w:tcPr>
+          <w:p>
+            <w:pPr>
+              <w:spacing w:after="0"/>
+            </w:pPr>
+            <w:r>
+              <w:rPr>
+                <w:rFonts w:ascii="Calibri" w:hAnsi="Calibri"/>
+                <w:sz w:val="19"/>
+              </w:rPr>
+              <w:t>Figure 6: Discovery of Plaintext Credentials for ilfserveradm in C:\panther\unattend.xml</w:t>
+            </w:r>
+          </w:p>
+        </w:tc>
+        <w:tc>
+          <w:tcPr>
+            <w:tcW w:type="dxa" w:w="1440"/>
+            <w:tcMar>
+              <w:top w:w="40" w:type="dxa"/>
+              <w:bottom w:w="40" w:type="dxa"/>
+              <w:left w:w="100" w:type="dxa"/>
+              <w:right w:w="100" w:type="dxa"/>
+            </w:tcMar>
+            <w:shd w:fill="FFFFFF"/>
+          </w:tcPr>
+          <w:p>
+            <w:pPr>
+              <w:spacing w:after="0"/>
+              <w:jc w:val="right"/>
+            </w:pPr>
+            <w:r>
+              <w:rPr>
+                <w:rFonts w:ascii="Calibri" w:hAnsi="Calibri"/>
+                <w:sz w:val="19"/>
+              </w:rPr>
+              <w:t>18</w:t>
+            </w:r>
+          </w:p>
+        </w:tc>
+      </w:tr>
+      <w:tr>
+        <w:tc>
+          <w:tcPr>
+            <w:tcW w:type="dxa" w:w="7920"/>
+            <w:tcMar>
+              <w:top w:w="40" w:type="dxa"/>
+              <w:bottom w:w="40" w:type="dxa"/>
+              <w:left w:w="100" w:type="dxa"/>
+              <w:right w:w="100" w:type="dxa"/>
+            </w:tcMar>
+            <w:shd w:fill="FFFFFF"/>
+          </w:tcPr>
+          <w:p>
+            <w:pPr>
+              <w:spacing w:after="0"/>
+            </w:pPr>
+            <w:r>
+              <w:rPr>
+                <w:rFonts w:ascii="Calibri" w:hAnsi="Calibri"/>
+                <w:sz w:val="19"/>
+              </w:rPr>
+              <w:t>Figure 7: Sysax Automation Service Interface Utilized for SYSTEM Privilege Escalation</w:t>
+            </w:r>
+          </w:p>
+        </w:tc>
+        <w:tc>
+          <w:tcPr>
+            <w:tcW w:type="dxa" w:w="1440"/>
+            <w:tcMar>
+              <w:top w:w="40" w:type="dxa"/>
+              <w:bottom w:w="40" w:type="dxa"/>
+              <w:left w:w="100" w:type="dxa"/>
+              <w:right w:w="100" w:type="dxa"/>
+            </w:tcMar>
+            <w:shd w:fill="FFFFFF"/>
+          </w:tcPr>
+          <w:p>
+            <w:pPr>
+              <w:spacing w:after="0"/>
+              <w:jc w:val="right"/>
+            </w:pPr>
+            <w:r>
+              <w:rPr>
+                <w:rFonts w:ascii="Calibri" w:hAnsi="Calibri"/>
+                <w:sz w:val="19"/>
+              </w:rPr>
+              <w:t>19</w:t>
+            </w:r>
+          </w:p>
+        </w:tc>
+      </w:tr>
+      <w:tr>
+        <w:tc>
+          <w:tcPr>
+            <w:tcW w:type="dxa" w:w="7920"/>
+            <w:tcMar>
+              <w:top w:w="40" w:type="dxa"/>
+              <w:bottom w:w="40" w:type="dxa"/>
+              <w:left w:w="100" w:type="dxa"/>
+              <w:right w:w="100" w:type="dxa"/>
+            </w:tcMar>
+            <w:shd w:fill="FFFFFF"/>
+          </w:tcPr>
+          <w:p>
+            <w:pPr>
+              <w:spacing w:after="0"/>
+            </w:pPr>
+            <w:r>
+              <w:rPr>
+                <w:rFonts w:ascii="Calibri" w:hAnsi="Calibri"/>
+                <w:sz w:val="19"/>
+              </w:rPr>
+              <w:t>Figure 8: Execution of Custom Batch Script Adding ilfserveradm to Local Administrators</w:t>
+            </w:r>
+          </w:p>
+        </w:tc>
+        <w:tc>
+          <w:tcPr>
+            <w:tcW w:type="dxa" w:w="1440"/>
+            <w:tcMar>
+              <w:top w:w="40" w:type="dxa"/>
+              <w:bottom w:w="40" w:type="dxa"/>
+              <w:left w:w="100" w:type="dxa"/>
+              <w:right w:w="100" w:type="dxa"/>
+            </w:tcMar>
+            <w:shd w:fill="FFFFFF"/>
+          </w:tcPr>
+          <w:p>
+            <w:pPr>
+              <w:spacing w:after="0"/>
+              <w:jc w:val="right"/>
+            </w:pPr>
+            <w:r>
+              <w:rPr>
+                <w:rFonts w:ascii="Calibri" w:hAnsi="Calibri"/>
+                <w:sz w:val="19"/>
+              </w:rPr>
+              <w:t>19</w:t>
+            </w:r>
+          </w:p>
+        </w:tc>
+      </w:tr>
+      <w:tr>
+        <w:tc>
+          <w:tcPr>
+            <w:tcW w:type="dxa" w:w="7920"/>
+            <w:tcMar>
+              <w:top w:w="40" w:type="dxa"/>
+              <w:bottom w:w="40" w:type="dxa"/>
+              <w:left w:w="100" w:type="dxa"/>
+              <w:right w:w="100" w:type="dxa"/>
+            </w:tcMar>
+            <w:shd w:fill="FFFFFF"/>
+          </w:tcPr>
+          <w:p>
+            <w:pPr>
+              <w:spacing w:after="0"/>
+            </w:pPr>
+            <w:r>
+              <w:rPr>
+                <w:rFonts w:ascii="Calibri" w:hAnsi="Calibri"/>
+                <w:sz w:val="19"/>
+              </w:rPr>
+              <w:t>Figure 9: Registry Winlogon DefaultUserName Query Confirming mssqladm Account</w:t>
+            </w:r>
+          </w:p>
+        </w:tc>
+        <w:tc>
+          <w:tcPr>
+            <w:tcW w:type="dxa" w:w="1440"/>
+            <w:tcMar>
+              <w:top w:w="40" w:type="dxa"/>
+              <w:bottom w:w="40" w:type="dxa"/>
+              <w:left w:w="100" w:type="dxa"/>
+              <w:right w:w="100" w:type="dxa"/>
+            </w:tcMar>
+            <w:shd w:fill="FFFFFF"/>
+          </w:tcPr>
+          <w:p>
+            <w:pPr>
+              <w:spacing w:after="0"/>
+              <w:jc w:val="right"/>
+            </w:pPr>
+            <w:r>
+              <w:rPr>
+                <w:rFonts w:ascii="Calibri" w:hAnsi="Calibri"/>
+                <w:sz w:val="19"/>
+              </w:rPr>
+              <w:t>20</w:t>
+            </w:r>
+          </w:p>
+        </w:tc>
+      </w:tr>
+      <w:tr>
+        <w:tc>
+          <w:tcPr>
+            <w:tcW w:type="dxa" w:w="7920"/>
+            <w:tcMar>
+              <w:top w:w="40" w:type="dxa"/>
+              <w:bottom w:w="40" w:type="dxa"/>
+              <w:left w:w="100" w:type="dxa"/>
+              <w:right w:w="100" w:type="dxa"/>
+            </w:tcMar>
+            <w:shd w:fill="FFFFFF"/>
+          </w:tcPr>
+          <w:p>
+            <w:pPr>
+              <w:spacing w:after="0"/>
+            </w:pPr>
+            <w:r>
+              <w:rPr>
+                <w:rFonts w:ascii="Calibri" w:hAnsi="Calibri"/>
+                <w:sz w:val="19"/>
+              </w:rPr>
+              <w:t>Figure 10: Mimikatz lsadump::secrets Dumping Cleartext Password for mssqladm</w:t>
+            </w:r>
+          </w:p>
+        </w:tc>
+        <w:tc>
+          <w:tcPr>
+            <w:tcW w:type="dxa" w:w="1440"/>
+            <w:tcMar>
+              <w:top w:w="40" w:type="dxa"/>
+              <w:bottom w:w="40" w:type="dxa"/>
+              <w:left w:w="100" w:type="dxa"/>
+              <w:right w:w="100" w:type="dxa"/>
+            </w:tcMar>
+            <w:shd w:fill="FFFFFF"/>
+          </w:tcPr>
+          <w:p>
+            <w:pPr>
+              <w:spacing w:after="0"/>
+              <w:jc w:val="right"/>
+            </w:pPr>
+            <w:r>
+              <w:rPr>
+                <w:rFonts w:ascii="Calibri" w:hAnsi="Calibri"/>
+                <w:sz w:val="19"/>
+              </w:rPr>
+              <w:t>20</w:t>
+            </w:r>
+          </w:p>
+        </w:tc>
+      </w:tr>
+      <w:tr>
+        <w:tc>
+          <w:tcPr>
+            <w:tcW w:type="dxa" w:w="7920"/>
+            <w:tcMar>
+              <w:top w:w="40" w:type="dxa"/>
+              <w:bottom w:w="40" w:type="dxa"/>
+              <w:left w:w="100" w:type="dxa"/>
+              <w:right w:w="100" w:type="dxa"/>
+            </w:tcMar>
+            <w:shd w:fill="FFFFFF"/>
+          </w:tcPr>
+          <w:p>
+            <w:pPr>
+              <w:spacing w:after="0"/>
+            </w:pPr>
+            <w:r>
+              <w:rPr>
+                <w:rFonts w:ascii="Calibri" w:hAnsi="Calibri"/>
+                <w:sz w:val="19"/>
+              </w:rPr>
+              <w:t>Figure 11: Targeted SPN Injection on ttimmons via bloodyAD GenericWrite Permission</w:t>
+            </w:r>
+          </w:p>
+        </w:tc>
+        <w:tc>
+          <w:tcPr>
+            <w:tcW w:type="dxa" w:w="1440"/>
+            <w:tcMar>
+              <w:top w:w="40" w:type="dxa"/>
+              <w:bottom w:w="40" w:type="dxa"/>
+              <w:left w:w="100" w:type="dxa"/>
+              <w:right w:w="100" w:type="dxa"/>
+            </w:tcMar>
+            <w:shd w:fill="FFFFFF"/>
+          </w:tcPr>
+          <w:p>
+            <w:pPr>
+              <w:spacing w:after="0"/>
+              <w:jc w:val="right"/>
+            </w:pPr>
+            <w:r>
+              <w:rPr>
+                <w:rFonts w:ascii="Calibri" w:hAnsi="Calibri"/>
+                <w:sz w:val="19"/>
+              </w:rPr>
+              <w:t>21</w:t>
+            </w:r>
+          </w:p>
+        </w:tc>
+      </w:tr>
+      <w:tr>
+        <w:tc>
+          <w:tcPr>
+            <w:tcW w:type="dxa" w:w="7920"/>
+            <w:tcMar>
+              <w:top w:w="40" w:type="dxa"/>
+              <w:bottom w:w="40" w:type="dxa"/>
+              <w:left w:w="100" w:type="dxa"/>
+              <w:right w:w="100" w:type="dxa"/>
+            </w:tcMar>
+            <w:shd w:fill="FFFFFF"/>
+          </w:tcPr>
+          <w:p>
+            <w:pPr>
+              <w:spacing w:after="0"/>
+            </w:pPr>
+            <w:r>
+              <w:rPr>
+                <w:rFonts w:ascii="Calibri" w:hAnsi="Calibri"/>
+                <w:sz w:val="19"/>
+              </w:rPr>
+              <w:t>Figure 12: Hashcat Offline TGS Ticket Cracking Recovering Password Repeat09 for ttimmons</w:t>
+            </w:r>
+          </w:p>
+        </w:tc>
+        <w:tc>
+          <w:tcPr>
+            <w:tcW w:type="dxa" w:w="1440"/>
+            <w:tcMar>
+              <w:top w:w="40" w:type="dxa"/>
+              <w:bottom w:w="40" w:type="dxa"/>
+              <w:left w:w="100" w:type="dxa"/>
+              <w:right w:w="100" w:type="dxa"/>
+            </w:tcMar>
+            <w:shd w:fill="FFFFFF"/>
+          </w:tcPr>
+          <w:p>
+            <w:pPr>
+              <w:spacing w:after="0"/>
+              <w:jc w:val="right"/>
+            </w:pPr>
+            <w:r>
+              <w:rPr>
+                <w:rFonts w:ascii="Calibri" w:hAnsi="Calibri"/>
+                <w:sz w:val="19"/>
+              </w:rPr>
+              <w:t>21</w:t>
+            </w:r>
+          </w:p>
+        </w:tc>
+      </w:tr>
+      <w:tr>
+        <w:tc>
+          <w:tcPr>
+            <w:tcW w:type="dxa" w:w="7920"/>
+            <w:tcMar>
+              <w:top w:w="40" w:type="dxa"/>
+              <w:bottom w:w="40" w:type="dxa"/>
+              <w:left w:w="100" w:type="dxa"/>
+              <w:right w:w="100" w:type="dxa"/>
+            </w:tcMar>
+            <w:shd w:fill="FFFFFF"/>
+          </w:tcPr>
+          <w:p>
+            <w:pPr>
+              <w:spacing w:after="0"/>
+            </w:pPr>
+            <w:r>
+              <w:rPr>
+                <w:rFonts w:ascii="Calibri" w:hAnsi="Calibri"/>
+                <w:sz w:val="19"/>
+              </w:rPr>
+              <w:t>Figure 13: Group Membership Query Confirming ttimmons Addition to Server Admins Group</w:t>
+            </w:r>
+          </w:p>
+        </w:tc>
+        <w:tc>
+          <w:tcPr>
+            <w:tcW w:type="dxa" w:w="1440"/>
+            <w:tcMar>
+              <w:top w:w="40" w:type="dxa"/>
+              <w:bottom w:w="40" w:type="dxa"/>
+              <w:left w:w="100" w:type="dxa"/>
+              <w:right w:w="100" w:type="dxa"/>
+            </w:tcMar>
+            <w:shd w:fill="FFFFFF"/>
+          </w:tcPr>
+          <w:p>
+            <w:pPr>
+              <w:spacing w:after="0"/>
+              <w:jc w:val="right"/>
+            </w:pPr>
+            <w:r>
+              <w:rPr>
+                <w:rFonts w:ascii="Calibri" w:hAnsi="Calibri"/>
+                <w:sz w:val="19"/>
+              </w:rPr>
+              <w:t>22</w:t>
+            </w:r>
+          </w:p>
+        </w:tc>
+      </w:tr>
+      <w:tr>
+        <w:tc>
+          <w:tcPr>
+            <w:tcW w:type="dxa" w:w="7920"/>
+            <w:tcMar>
+              <w:top w:w="40" w:type="dxa"/>
+              <w:bottom w:w="40" w:type="dxa"/>
+              <w:left w:w="100" w:type="dxa"/>
+              <w:right w:w="100" w:type="dxa"/>
+            </w:tcMar>
+            <w:shd w:fill="FFFFFF"/>
+          </w:tcPr>
+          <w:p>
+            <w:pPr>
+              <w:spacing w:after="0"/>
+            </w:pPr>
+            <w:r>
+              <w:rPr>
+                <w:rFonts w:ascii="Calibri" w:hAnsi="Calibri"/>
+                <w:sz w:val="19"/>
+              </w:rPr>
+              <w:t>Figure 14: Impacket secretsdump.py Performing DCSync Replication Dumping NTLM Hashes</w:t>
+            </w:r>
+          </w:p>
+        </w:tc>
+        <w:tc>
+          <w:tcPr>
+            <w:tcW w:type="dxa" w:w="1440"/>
+            <w:tcMar>
+              <w:top w:w="40" w:type="dxa"/>
+              <w:bottom w:w="40" w:type="dxa"/>
+              <w:left w:w="100" w:type="dxa"/>
+              <w:right w:w="100" w:type="dxa"/>
+            </w:tcMar>
+            <w:shd w:fill="FFFFFF"/>
+          </w:tcPr>
+          <w:p>
+            <w:pPr>
+              <w:spacing w:after="0"/>
+              <w:jc w:val="right"/>
+            </w:pPr>
+            <w:r>
+              <w:rPr>
+                <w:rFonts w:ascii="Calibri" w:hAnsi="Calibri"/>
+                <w:sz w:val="19"/>
+              </w:rPr>
+              <w:t>23</w:t>
+            </w:r>
+          </w:p>
+        </w:tc>
+      </w:tr>
+      <w:tr>
+        <w:tc>
+          <w:tcPr>
+            <w:tcW w:type="dxa" w:w="7920"/>
+            <w:tcMar>
+              <w:top w:w="40" w:type="dxa"/>
+              <w:bottom w:w="40" w:type="dxa"/>
+              <w:left w:w="100" w:type="dxa"/>
+              <w:right w:w="100" w:type="dxa"/>
+            </w:tcMar>
+            <w:shd w:fill="FFFFFF"/>
+          </w:tcPr>
+          <w:p>
+            <w:pPr>
+              <w:spacing w:after="0"/>
+            </w:pPr>
+            <w:r>
+              <w:rPr>
+                <w:rFonts w:ascii="Calibri" w:hAnsi="Calibri"/>
+                <w:sz w:val="19"/>
+              </w:rPr>
+              <w:t>Figure 15: BloodHound Full Attack Path Visualizing Chained Escalation from hporter to DCSync</w:t>
+            </w:r>
+          </w:p>
+        </w:tc>
+        <w:tc>
+          <w:tcPr>
+            <w:tcW w:type="dxa" w:w="1440"/>
+            <w:tcMar>
+              <w:top w:w="40" w:type="dxa"/>
+              <w:bottom w:w="40" w:type="dxa"/>
+              <w:left w:w="100" w:type="dxa"/>
+              <w:right w:w="100" w:type="dxa"/>
+            </w:tcMar>
+            <w:shd w:fill="FFFFFF"/>
+          </w:tcPr>
+          <w:p>
+            <w:pPr>
+              <w:spacing w:after="0"/>
+              <w:jc w:val="right"/>
+            </w:pPr>
+            <w:r>
+              <w:rPr>
+                <w:rFonts w:ascii="Calibri" w:hAnsi="Calibri"/>
+                <w:sz w:val="19"/>
+              </w:rPr>
+              <w:t>24</w:t>
+            </w:r>
+          </w:p>
+        </w:tc>
+      </w:tr>
+    </w:tbl>
+    <w:p>
+      <w:pPr>
+        <w:keepNext/>
+        <w:spacing w:before="280" w:after="80"/>
+      </w:pPr>
+      <w:r>
+        <w:rPr>
+          <w:rFonts w:ascii="Calibri" w:hAnsi="Calibri"/>
+          <w:b/>
+          <w:color w:val="2F5597"/>
+          <w:sz w:val="28"/>
+        </w:rPr>
+        <w:t>List of Tables</w:t>
+      </w:r>
+    </w:p>
+    <w:tbl>
+      <w:tblPr>
+        <w:tblW w:type="auto" w:w="0"/>
+        <w:jc w:val="center"/>
+        <w:tblLook w:firstColumn="1" w:firstRow="1" w:lastColumn="0" w:lastRow="0" w:noHBand="0" w:noVBand="1" w:val="04A0"/>
+      </w:tblPr>
+      <w:tblGrid>
+        <w:gridCol w:w="4680"/>
+        <w:gridCol w:w="4680"/>
+      </w:tblGrid>
+      <w:tr>
+        <w:tc>
+          <w:tcPr>
+            <w:tcW w:type="dxa" w:w="7920"/>
+            <w:shd w:fill="1F4E79"/>
+            <w:tcMar>
+              <w:top w:w="80" w:type="dxa"/>
+              <w:bottom w:w="80" w:type="dxa"/>
+              <w:left w:w="100" w:type="dxa"/>
+              <w:right w:w="100" w:type="dxa"/>
+            </w:tcMar>
+          </w:tcPr>
+          <w:p>
+            <w:r>
+              <w:rPr>
+                <w:rFonts w:ascii="Calibri" w:hAnsi="Calibri"/>
+                <w:b/>
+                <w:color w:val="FFFFFF"/>
+              </w:rPr>
+              <w:t>Table Caption &amp; Title</w:t>
+            </w:r>
+          </w:p>
+        </w:tc>
+        <w:tc>
+          <w:tcPr>
+            <w:tcW w:type="dxa" w:w="1440"/>
+            <w:shd w:fill="1F4E79"/>
+            <w:tcMar>
+              <w:top w:w="80" w:type="dxa"/>
+              <w:bottom w:w="80" w:type="dxa"/>
+              <w:left w:w="100" w:type="dxa"/>
+              <w:right w:w="100" w:type="dxa"/>
+            </w:tcMar>
+          </w:tcPr>
+          <w:p>
+            <w:pPr>
+              <w:jc w:val="right"/>
+            </w:pPr>
+            <w:r>
+              <w:rPr>
+                <w:rFonts w:ascii="Calibri" w:hAnsi="Calibri"/>
+                <w:b/>
+                <w:color w:val="FFFFFF"/>
+              </w:rPr>
+              <w:t>Page</w:t>
+            </w:r>
+          </w:p>
+        </w:tc>
+      </w:tr>
+      <w:tr>
+        <w:tc>
+          <w:tcPr>
+            <w:tcW w:type="dxa" w:w="7920"/>
+            <w:tcMar>
+              <w:top w:w="40" w:type="dxa"/>
+              <w:bottom w:w="40" w:type="dxa"/>
+              <w:left w:w="100" w:type="dxa"/>
+              <w:right w:w="100" w:type="dxa"/>
+            </w:tcMar>
+            <w:shd w:fill="FFFFFF"/>
+          </w:tcPr>
+          <w:p>
+            <w:pPr>
+              <w:spacing w:after="0"/>
+            </w:pPr>
+            <w:r>
+              <w:rPr>
+                <w:rFonts w:ascii="Calibri" w:hAnsi="Calibri"/>
+                <w:sz w:val="19"/>
+              </w:rPr>
+              <w:t>Table 1: Target Environment Host Details and Scope Demarcation</w:t>
+            </w:r>
+          </w:p>
+        </w:tc>
+        <w:tc>
+          <w:tcPr>
+            <w:tcW w:type="dxa" w:w="1440"/>
+            <w:tcMar>
+              <w:top w:w="40" w:type="dxa"/>
+              <w:bottom w:w="40" w:type="dxa"/>
+              <w:left w:w="100" w:type="dxa"/>
+              <w:right w:w="100" w:type="dxa"/>
+            </w:tcMar>
+            <w:shd w:fill="FFFFFF"/>
+          </w:tcPr>
+          <w:p>
+            <w:pPr>
+              <w:spacing w:after="0"/>
+              <w:jc w:val="right"/>
+            </w:pPr>
+            <w:r>
+              <w:rPr>
+                <w:rFonts w:ascii="Calibri" w:hAnsi="Calibri"/>
+                <w:sz w:val="19"/>
+              </w:rPr>
+              <w:t>6</w:t>
+            </w:r>
+          </w:p>
+        </w:tc>
+      </w:tr>
+      <w:tr>
+        <w:tc>
+          <w:tcPr>
+            <w:tcW w:type="dxa" w:w="7920"/>
+            <w:tcMar>
+              <w:top w:w="40" w:type="dxa"/>
+              <w:bottom w:w="40" w:type="dxa"/>
+              <w:left w:w="100" w:type="dxa"/>
+              <w:right w:w="100" w:type="dxa"/>
+            </w:tcMar>
+            <w:shd w:fill="FFFFFF"/>
+          </w:tcPr>
+          <w:p>
+            <w:pPr>
+              <w:spacing w:after="0"/>
+            </w:pPr>
+            <w:r>
+              <w:rPr>
+                <w:rFonts w:ascii="Calibri" w:hAnsi="Calibri"/>
+                <w:sz w:val="19"/>
+              </w:rPr>
+              <w:t>Table 2: Tooling Selection and Rationale Matrix</w:t>
+            </w:r>
+          </w:p>
+        </w:tc>
+        <w:tc>
+          <w:tcPr>
+            <w:tcW w:type="dxa" w:w="1440"/>
+            <w:tcMar>
+              <w:top w:w="40" w:type="dxa"/>
+              <w:bottom w:w="40" w:type="dxa"/>
+              <w:left w:w="100" w:type="dxa"/>
+              <w:right w:w="100" w:type="dxa"/>
+            </w:tcMar>
+            <w:shd w:fill="FFFFFF"/>
+          </w:tcPr>
+          <w:p>
+            <w:pPr>
+              <w:spacing w:after="0"/>
+              <w:jc w:val="right"/>
+            </w:pPr>
+            <w:r>
+              <w:rPr>
+                <w:rFonts w:ascii="Calibri" w:hAnsi="Calibri"/>
+                <w:sz w:val="19"/>
+              </w:rPr>
+              <w:t>8</w:t>
+            </w:r>
+          </w:p>
+        </w:tc>
+      </w:tr>
+      <w:tr>
+        <w:tc>
+          <w:tcPr>
+            <w:tcW w:type="dxa" w:w="7920"/>
+            <w:tcMar>
+              <w:top w:w="40" w:type="dxa"/>
+              <w:bottom w:w="40" w:type="dxa"/>
+              <w:left w:w="100" w:type="dxa"/>
+              <w:right w:w="100" w:type="dxa"/>
+            </w:tcMar>
+            <w:shd w:fill="FFFFFF"/>
+          </w:tcPr>
+          <w:p>
+            <w:pPr>
+              <w:spacing w:after="0"/>
+            </w:pPr>
+            <w:r>
+              <w:rPr>
+                <w:rFonts w:ascii="Calibri" w:hAnsi="Calibri"/>
+                <w:sz w:val="19"/>
+              </w:rPr>
+              <w:t>Table 3: Summary of Root-Cause Misconfigurations and Business Impact</w:t>
+            </w:r>
+          </w:p>
+        </w:tc>
+        <w:tc>
+          <w:tcPr>
+            <w:tcW w:type="dxa" w:w="1440"/>
+            <w:tcMar>
+              <w:top w:w="40" w:type="dxa"/>
+              <w:bottom w:w="40" w:type="dxa"/>
+              <w:left w:w="100" w:type="dxa"/>
+              <w:right w:w="100" w:type="dxa"/>
+            </w:tcMar>
+            <w:shd w:fill="FFFFFF"/>
+          </w:tcPr>
+          <w:p>
+            <w:pPr>
+              <w:spacing w:after="0"/>
+              <w:jc w:val="right"/>
+            </w:pPr>
+            <w:r>
+              <w:rPr>
+                <w:rFonts w:ascii="Calibri" w:hAnsi="Calibri"/>
+                <w:sz w:val="19"/>
+              </w:rPr>
+              <w:t>26</w:t>
             </w:r>
           </w:p>
         </w:tc>
@@ -4187,7 +5327,7 @@
           <w:color w:val="1A1A1A"/>
           <w:sz w:val="22"/>
         </w:rPr>
-        <w:t xml:space="preserve">Phase 1: Initial Foothold &amp; Authentication Verification — </w:t>
+        <w:t xml:space="preserve">Phase 1: Initial Foothold &amp; Authentication Verification - </w:t>
       </w:r>
       <w:r>
         <w:rPr>
@@ -4210,7 +5350,7 @@
           <w:color w:val="1A1A1A"/>
           <w:sz w:val="22"/>
         </w:rPr>
-        <w:t xml:space="preserve">Phase 2: Active Directory Graph Enumeration — </w:t>
+        <w:t xml:space="preserve">Phase 2: Active Directory Graph Enumeration - </w:t>
       </w:r>
       <w:r>
         <w:rPr>
@@ -4233,7 +5373,7 @@
           <w:color w:val="1A1A1A"/>
           <w:sz w:val="22"/>
         </w:rPr>
-        <w:t xml:space="preserve">Phase 3: Domain Account Takeover &amp; Share Credential Harvesting — </w:t>
+        <w:t xml:space="preserve">Phase 3: Domain Account Takeover &amp; Share Credential Harvesting - </w:t>
       </w:r>
       <w:r>
         <w:rPr>
@@ -4256,7 +5396,7 @@
           <w:color w:val="1A1A1A"/>
           <w:sz w:val="22"/>
         </w:rPr>
-        <w:t xml:space="preserve">Phase 4: Lateral Movement &amp; Local Host Exploitation — </w:t>
+        <w:t xml:space="preserve">Phase 4: Lateral Movement &amp; Local Host Exploitation - </w:t>
       </w:r>
       <w:r>
         <w:rPr>
@@ -4279,7 +5419,7 @@
           <w:color w:val="1A1A1A"/>
           <w:sz w:val="22"/>
         </w:rPr>
-        <w:t xml:space="preserve">Phase 5: LSA Secrets Dump &amp; Targeted Kerberoasting — </w:t>
+        <w:t xml:space="preserve">Phase 5: LSA Secrets Dump &amp; Targeted Kerberoasting - </w:t>
       </w:r>
       <w:r>
         <w:rPr>
@@ -4302,7 +5442,7 @@
           <w:color w:val="1A1A1A"/>
           <w:sz w:val="22"/>
         </w:rPr>
-        <w:t xml:space="preserve">Phase 6: Privileged Group Escalation &amp; DCSync Domain Takeover — </w:t>
+        <w:t xml:space="preserve">Phase 6: Privileged Group Escalation &amp; DCSync Domain Takeover - </w:t>
       </w:r>
       <w:r>
         <w:rPr>
@@ -6657,7 +7797,7 @@
           <w:color w:val="2F5597"/>
           <w:sz w:val="28"/>
         </w:rPr>
-        <w:t>5.11 Stage 11: DCSync Attack — Full Domain Credential Extraction</w:t>
+        <w:t>5.11 Stage 11: DCSync Attack - Full Domain Credential Extraction</w:t>
       </w:r>
     </w:p>
     <w:p>
@@ -8445,7 +9585,7 @@
           <w:color w:val="333333"/>
           <w:sz w:val="22"/>
         </w:rPr>
-        <w:t>Implementing the remediation roadmap provided in Section 6—specifically revoking replication rights, auditing object ACLs, deploying gMSAs, removing cleartext scripts, and enforcing Tiered Administration—will effectively eliminate these attack vectors and protect the Active Directory environment against sophisticated real-world adversaries.</w:t>
+        <w:t>Implementing the remediation roadmap provided in Section 6 - specifically revoking replication rights, auditing object ACLs, deploying gMSAs, removing cleartext scripts, and enforcing Tiered Administration - will effectively eliminate these attack vectors and protect the Active Directory environment against sophisticated real-world adversaries.</w:t>
       </w:r>
     </w:p>
     <w:p>
@@ -9406,7 +10546,7 @@
         <w:color w:val="888888"/>
         <w:sz w:val="17"/>
       </w:rPr>
-      <w:t>CONFIDENTIAL — ACADEMIC RED TEAM ASSESSMENT REPORT</w:t>
+      <w:t>CONFIDENTIAL - ACADEMIC RED TEAM ASSESSMENT REPORT</w:t>
     </w:r>
   </w:p>
 </w:ftr>

</xml_diff>